<commit_message>
change the order of the functions + edit the word file
</commit_message>
<xml_diff>
--- a/AI Assignment 3.docx
+++ b/AI Assignment 3.docx
@@ -8,9 +8,8 @@
         <w:ind w:right="97"/>
         <w:jc w:val="center"/>
         <w:rPr>
-          <w:b/>
-          <w:color w:val="0E2841" w:themeColor="text2"/>
-          <w:sz w:val="32"/>
+          <w:noProof/>
+          <w:color w:val="0E2841" w:themeColor="text2"/>
         </w:rPr>
       </w:pPr>
       <w:r>
@@ -19,24 +18,18 @@
           <w:color w:val="0E2841" w:themeColor="text2"/>
         </w:rPr>
         <w:drawing>
-          <wp:anchor distT="0" distB="0" distL="114300" distR="114300" simplePos="0" relativeHeight="251659264" behindDoc="1" locked="0" layoutInCell="1" allowOverlap="1" wp14:anchorId="43F3EA90" wp14:editId="75675A66">
+          <wp:anchor distT="0" distB="0" distL="114300" distR="114300" simplePos="0" relativeHeight="251663360" behindDoc="0" locked="0" layoutInCell="1" allowOverlap="1" wp14:anchorId="343EBE61" wp14:editId="06B33E4D">
             <wp:simplePos x="0" y="0"/>
             <wp:positionH relativeFrom="margin">
-              <wp:align>center</wp:align>
+              <wp:posOffset>-347435</wp:posOffset>
             </wp:positionH>
             <wp:positionV relativeFrom="paragraph">
-              <wp:posOffset>-645795</wp:posOffset>
+              <wp:posOffset>-206556</wp:posOffset>
             </wp:positionV>
-            <wp:extent cx="7784789" cy="1268245"/>
-            <wp:effectExtent l="0" t="0" r="6985" b="8255"/>
+            <wp:extent cx="1235747" cy="1328057"/>
+            <wp:effectExtent l="0" t="0" r="2540" b="5715"/>
             <wp:wrapNone/>
-            <wp:docPr id="1309946036" name="drawing" descr="Inserting image...">
-              <a:extLst xmlns:a="http://schemas.openxmlformats.org/drawingml/2006/main">
-                <a:ext uri="{FF2B5EF4-FFF2-40B4-BE49-F238E27FC236}">
-                  <a16:creationId xmlns:a16="http://schemas.microsoft.com/office/drawing/2014/main" id="{99F4FE76-1FB4-470E-BC94-42FACB9D3949}"/>
-                </a:ext>
-              </a:extLst>
-            </wp:docPr>
+            <wp:docPr id="256630800" name="drawing" descr="Inserting image..."/>
             <wp:cNvGraphicFramePr>
               <a:graphicFrameLocks xmlns:a="http://schemas.openxmlformats.org/drawingml/2006/main" noChangeAspect="1"/>
             </wp:cNvGraphicFramePr>
@@ -44,37 +37,108 @@
               <a:graphicData uri="http://schemas.openxmlformats.org/drawingml/2006/picture">
                 <pic:pic xmlns:pic="http://schemas.openxmlformats.org/drawingml/2006/picture">
                   <pic:nvPicPr>
-                    <pic:cNvPr id="1261427027" name=""/>
-                    <pic:cNvPicPr/>
+                    <pic:cNvPr id="1309946036" name="drawing" descr="Inserting image..."/>
+                    <pic:cNvPicPr>
+                      <a:picLocks noChangeAspect="1"/>
+                    </pic:cNvPicPr>
                   </pic:nvPicPr>
-                  <pic:blipFill>
-                    <a:blip r:embed="rId7">
-                      <a:extLst>
-                        <a:ext uri="{28A0092B-C50C-407E-A947-70E740481C1C}">
-                          <a14:useLocalDpi xmlns:a14="http://schemas.microsoft.com/office/drawing/2010/main"/>
-                        </a:ext>
-                      </a:extLst>
-                    </a:blip>
+                  <pic:blipFill rotWithShape="1">
+                    <a:blip r:embed="rId10"/>
+                    <a:srcRect r="84839"/>
                     <a:stretch>
                       <a:fillRect/>
                     </a:stretch>
                   </pic:blipFill>
-                  <pic:spPr>
+                  <pic:spPr bwMode="auto">
                     <a:xfrm>
                       <a:off x="0" y="0"/>
-                      <a:ext cx="7784789" cy="1268245"/>
+                      <a:ext cx="1235747" cy="1328057"/>
                     </a:xfrm>
                     <a:prstGeom prst="rect">
                       <a:avLst/>
                     </a:prstGeom>
+                    <a:ln>
+                      <a:noFill/>
+                    </a:ln>
+                    <a:extLst>
+                      <a:ext uri="{53640926-AAD7-44D8-BBD7-CCE9431645EC}">
+                        <a14:shadowObscured xmlns:a14="http://schemas.microsoft.com/office/drawing/2010/main"/>
+                      </a:ext>
+                    </a:extLst>
                   </pic:spPr>
                 </pic:pic>
               </a:graphicData>
             </a:graphic>
-            <wp14:sizeRelH relativeFrom="page">
+            <wp14:sizeRelH relativeFrom="margin">
               <wp14:pctWidth>0</wp14:pctWidth>
             </wp14:sizeRelH>
-            <wp14:sizeRelV relativeFrom="page">
+            <wp14:sizeRelV relativeFrom="margin">
+              <wp14:pctHeight>0</wp14:pctHeight>
+            </wp14:sizeRelV>
+          </wp:anchor>
+        </w:drawing>
+      </w:r>
+      <w:r>
+        <w:rPr>
+          <w:noProof/>
+          <w:color w:val="0E2841" w:themeColor="text2"/>
+        </w:rPr>
+        <w:drawing>
+          <wp:anchor distT="0" distB="0" distL="114300" distR="114300" simplePos="0" relativeHeight="251659264" behindDoc="0" locked="0" layoutInCell="1" allowOverlap="1" wp14:anchorId="4A37F64A" wp14:editId="2C5AE384">
+            <wp:simplePos x="0" y="0"/>
+            <wp:positionH relativeFrom="margin">
+              <wp:posOffset>4974625</wp:posOffset>
+            </wp:positionH>
+            <wp:positionV relativeFrom="paragraph">
+              <wp:posOffset>-359228</wp:posOffset>
+            </wp:positionV>
+            <wp:extent cx="1315902" cy="1564263"/>
+            <wp:effectExtent l="0" t="0" r="0" b="0"/>
+            <wp:wrapNone/>
+            <wp:docPr id="1309946036" name="drawing" descr="Inserting image..."/>
+            <wp:cNvGraphicFramePr>
+              <a:graphicFrameLocks xmlns:a="http://schemas.openxmlformats.org/drawingml/2006/main" noChangeAspect="1"/>
+            </wp:cNvGraphicFramePr>
+            <a:graphic xmlns:a="http://schemas.openxmlformats.org/drawingml/2006/main">
+              <a:graphicData uri="http://schemas.openxmlformats.org/drawingml/2006/picture">
+                <pic:pic xmlns:pic="http://schemas.openxmlformats.org/drawingml/2006/picture">
+                  <pic:nvPicPr>
+                    <pic:cNvPr id="1309946036" name="drawing" descr="Inserting image..."/>
+                    <pic:cNvPicPr>
+                      <a:picLocks noChangeAspect="1"/>
+                    </pic:cNvPicPr>
+                  </pic:nvPicPr>
+                  <pic:blipFill rotWithShape="1">
+                    <a:blip r:embed="rId10"/>
+                    <a:srcRect l="15004" r="69678"/>
+                    <a:stretch>
+                      <a:fillRect/>
+                    </a:stretch>
+                  </pic:blipFill>
+                  <pic:spPr bwMode="auto">
+                    <a:xfrm>
+                      <a:off x="0" y="0"/>
+                      <a:ext cx="1315902" cy="1564263"/>
+                    </a:xfrm>
+                    <a:prstGeom prst="rect">
+                      <a:avLst/>
+                    </a:prstGeom>
+                    <a:ln>
+                      <a:noFill/>
+                    </a:ln>
+                    <a:extLst>
+                      <a:ext uri="{53640926-AAD7-44D8-BBD7-CCE9431645EC}">
+                        <a14:shadowObscured xmlns:a14="http://schemas.microsoft.com/office/drawing/2010/main"/>
+                      </a:ext>
+                    </a:extLst>
+                  </pic:spPr>
+                </pic:pic>
+              </a:graphicData>
+            </a:graphic>
+            <wp14:sizeRelH relativeFrom="margin">
+              <wp14:pctWidth>0</wp14:pctWidth>
+            </wp14:sizeRelH>
+            <wp14:sizeRelV relativeFrom="margin">
               <wp14:pctHeight>0</wp14:pctHeight>
             </wp14:sizeRelV>
           </wp:anchor>
@@ -84,10 +148,23 @@
     <w:p>
       <w:pPr>
         <w:spacing w:after="0" w:line="259" w:lineRule="auto"/>
-        <w:ind w:left="0" w:firstLine="0"/>
+        <w:ind w:right="97"/>
         <w:jc w:val="center"/>
         <w:rPr>
-          <w:color w:val="0E2841" w:themeColor="text2"/>
+          <w:noProof/>
+          <w:color w:val="0E2841" w:themeColor="text2"/>
+        </w:rPr>
+      </w:pPr>
+    </w:p>
+    <w:p>
+      <w:pPr>
+        <w:spacing w:after="0" w:line="259" w:lineRule="auto"/>
+        <w:ind w:right="97"/>
+        <w:jc w:val="center"/>
+        <w:rPr>
+          <w:b/>
+          <w:color w:val="0E2841" w:themeColor="text2"/>
+          <w:sz w:val="32"/>
         </w:rPr>
       </w:pPr>
     </w:p>
@@ -104,12 +181,10 @@
     <w:p>
       <w:pPr>
         <w:spacing w:after="0" w:line="259" w:lineRule="auto"/>
-        <w:ind w:left="0" w:right="97" w:firstLine="0"/>
-        <w:rPr>
-          <w:b/>
-          <w:color w:val="000000" w:themeColor="text1"/>
-          <w:sz w:val="40"/>
-          <w:szCs w:val="40"/>
+        <w:ind w:left="0" w:firstLine="0"/>
+        <w:jc w:val="center"/>
+        <w:rPr>
+          <w:color w:val="0E2841" w:themeColor="text2"/>
         </w:rPr>
       </w:pPr>
     </w:p>
@@ -127,26 +202,33 @@
     </w:p>
     <w:p>
       <w:pPr>
-        <w:spacing w:after="180" w:line="259" w:lineRule="auto"/>
-        <w:ind w:left="39"/>
+        <w:spacing w:after="0" w:line="259" w:lineRule="auto"/>
+        <w:ind w:left="0" w:right="97" w:firstLine="0"/>
         <w:jc w:val="center"/>
         <w:rPr>
-          <w:rFonts w:ascii="Consolas" w:hAnsi="Consolas"/>
           <w:b/>
-          <w:color w:val="0E2841" w:themeColor="text2"/>
-          <w:sz w:val="52"/>
-          <w:szCs w:val="52"/>
+          <w:color w:val="0A2F41" w:themeColor="accent1" w:themeShade="80"/>
+          <w:sz w:val="36"/>
+          <w:szCs w:val="36"/>
         </w:rPr>
       </w:pPr>
       <w:r>
         <w:rPr>
-          <w:rFonts w:ascii="Consolas" w:hAnsi="Consolas"/>
           <w:b/>
-          <w:color w:val="0E2841" w:themeColor="text2"/>
-          <w:sz w:val="52"/>
-          <w:szCs w:val="52"/>
-        </w:rPr>
-        <w:t>AI Assignment 3</w:t>
+          <w:color w:val="0A2F41" w:themeColor="accent1" w:themeShade="80"/>
+          <w:sz w:val="44"/>
+          <w:szCs w:val="44"/>
+        </w:rPr>
+        <w:t>Faculty of Computers and Artificial Intelligence</w:t>
+      </w:r>
+      <w:r>
+        <w:rPr>
+          <w:b/>
+          <w:color w:val="0A2F41" w:themeColor="accent1" w:themeShade="80"/>
+          <w:sz w:val="44"/>
+          <w:szCs w:val="44"/>
+        </w:rPr>
+        <w:br/>
       </w:r>
     </w:p>
     <w:p>
@@ -158,10 +240,54 @@
           <w:rFonts w:ascii="Consolas" w:hAnsi="Consolas"/>
           <w:b/>
           <w:color w:val="0E2841" w:themeColor="text2"/>
-          <w:sz w:val="52"/>
-          <w:szCs w:val="52"/>
+          <w:sz w:val="40"/>
+          <w:szCs w:val="40"/>
         </w:rPr>
       </w:pPr>
+      <w:r>
+        <w:rPr>
+          <w:rFonts w:ascii="Consolas" w:hAnsi="Consolas"/>
+          <w:b/>
+          <w:color w:val="0E2841" w:themeColor="text2"/>
+          <w:sz w:val="40"/>
+          <w:szCs w:val="40"/>
+        </w:rPr>
+        <w:t>AI Assignment 3</w:t>
+      </w:r>
+      <w:r>
+        <w:rPr>
+          <w:rFonts w:ascii="Consolas" w:hAnsi="Consolas"/>
+          <w:b/>
+          <w:color w:val="0E2841" w:themeColor="text2"/>
+          <w:sz w:val="40"/>
+          <w:szCs w:val="40"/>
+        </w:rPr>
+        <w:t xml:space="preserve"> - </w:t>
+      </w:r>
+      <w:proofErr w:type="spellStart"/>
+      <w:r>
+        <w:rPr>
+          <w:rFonts w:ascii="Consolas" w:hAnsi="Consolas"/>
+          <w:b/>
+          <w:bCs/>
+          <w:color w:val="0E2841" w:themeColor="text2"/>
+          <w:sz w:val="40"/>
+          <w:szCs w:val="40"/>
+        </w:rPr>
+        <w:t>Hnefatafl</w:t>
+      </w:r>
+      <w:proofErr w:type="spellEnd"/>
+      <w:r>
+        <w:rPr>
+          <w:rFonts w:ascii="Consolas" w:hAnsi="Consolas"/>
+          <w:b/>
+          <w:bCs/>
+          <w:color w:val="0E2841" w:themeColor="text2"/>
+          <w:sz w:val="40"/>
+          <w:szCs w:val="40"/>
+        </w:rPr>
+        <w:t xml:space="preserve"> Game</w:t>
+      </w:r>
     </w:p>
     <w:p>
       <w:pPr>
@@ -170,11 +296,90 @@
         <w:jc w:val="center"/>
         <w:rPr>
           <w:rFonts w:ascii="Consolas" w:hAnsi="Consolas"/>
+          <w:b/>
+          <w:color w:val="0E2841" w:themeColor="text2"/>
+          <w:sz w:val="40"/>
+          <w:szCs w:val="40"/>
+        </w:rPr>
+      </w:pPr>
+      <w:r>
+        <w:rPr>
+          <w:rFonts w:ascii="Consolas" w:hAnsi="Consolas"/>
+          <w:b/>
+          <w:color w:val="0E2841" w:themeColor="text2"/>
+          <w:sz w:val="40"/>
+          <w:szCs w:val="40"/>
+        </w:rPr>
+        <w:t xml:space="preserve">Dr. </w:t>
+      </w:r>
+      <w:r>
+        <w:rPr>
+          <w:rFonts w:ascii="Consolas" w:hAnsi="Consolas"/>
+          <w:b/>
+          <w:color w:val="0E2841" w:themeColor="text2"/>
+          <w:sz w:val="40"/>
+          <w:szCs w:val="40"/>
+        </w:rPr>
+        <w:t>Khaled Tawfik</w:t>
+      </w:r>
+    </w:p>
+    <w:p>
+      <w:pPr>
+        <w:spacing w:after="180" w:line="259" w:lineRule="auto"/>
+        <w:ind w:left="39"/>
+        <w:jc w:val="center"/>
+        <w:rPr>
+          <w:rFonts w:ascii="Consolas" w:hAnsi="Consolas"/>
+          <w:b/>
+          <w:color w:val="0E2841" w:themeColor="text2"/>
+          <w:sz w:val="40"/>
+          <w:szCs w:val="40"/>
+        </w:rPr>
+      </w:pPr>
+      <w:r>
+        <w:rPr>
+          <w:rFonts w:ascii="Consolas" w:hAnsi="Consolas"/>
+          <w:b/>
+          <w:color w:val="0E2841" w:themeColor="text2"/>
+          <w:sz w:val="40"/>
+          <w:szCs w:val="40"/>
+        </w:rPr>
+        <w:t>TA: Sara</w:t>
+      </w:r>
+      <w:r>
+        <w:rPr>
+          <w:rFonts w:ascii="Consolas" w:hAnsi="Consolas"/>
+          <w:b/>
+          <w:color w:val="0E2841" w:themeColor="text2"/>
+          <w:sz w:val="40"/>
+          <w:szCs w:val="40"/>
+        </w:rPr>
+        <w:t>h Ahmed</w:t>
+      </w:r>
+    </w:p>
+    <w:p>
+      <w:pPr>
+        <w:tabs>
+          <w:tab w:val="left" w:pos="686"/>
+        </w:tabs>
+        <w:spacing w:after="180" w:line="259" w:lineRule="auto"/>
+        <w:ind w:left="39"/>
+        <w:rPr>
+          <w:rFonts w:ascii="Consolas" w:hAnsi="Consolas"/>
+          <w:color w:val="0E2841" w:themeColor="text2"/>
+          <w:sz w:val="32"/>
+          <w:szCs w:val="32"/>
+        </w:rPr>
+      </w:pPr>
+      <w:r>
+        <w:rPr>
+          <w:rFonts w:ascii="Consolas" w:hAnsi="Consolas"/>
           <w:color w:val="0E2841" w:themeColor="text2"/>
           <w:sz w:val="52"/>
           <w:szCs w:val="52"/>
         </w:rPr>
-      </w:pPr>
+        <w:tab/>
+      </w:r>
     </w:p>
     <w:p>
       <w:pPr>
@@ -185,39 +390,27 @@
           <w:rFonts w:ascii="Consolas" w:hAnsi="Consolas"/>
           <w:b/>
           <w:color w:val="0E2841" w:themeColor="text2"/>
-          <w:sz w:val="48"/>
-          <w:szCs w:val="48"/>
+          <w:sz w:val="40"/>
+          <w:szCs w:val="40"/>
         </w:rPr>
       </w:pPr>
-      <w:proofErr w:type="gramStart"/>
       <w:r>
         <w:rPr>
           <w:rFonts w:ascii="Consolas" w:hAnsi="Consolas"/>
           <w:b/>
           <w:color w:val="0E2841" w:themeColor="text2"/>
-          <w:sz w:val="48"/>
-          <w:szCs w:val="48"/>
-        </w:rPr>
-        <w:t>Student</w:t>
+          <w:sz w:val="40"/>
+          <w:szCs w:val="40"/>
+        </w:rPr>
+        <w:t>Students’</w:t>
       </w:r>
       <w:r>
         <w:rPr>
           <w:rFonts w:ascii="Consolas" w:hAnsi="Consolas"/>
           <w:b/>
           <w:color w:val="0E2841" w:themeColor="text2"/>
-          <w:sz w:val="48"/>
-          <w:szCs w:val="48"/>
-        </w:rPr>
-        <w:t>s</w:t>
-      </w:r>
-      <w:proofErr w:type="gramEnd"/>
-      <w:r>
-        <w:rPr>
-          <w:rFonts w:ascii="Consolas" w:hAnsi="Consolas"/>
-          <w:b/>
-          <w:color w:val="0E2841" w:themeColor="text2"/>
-          <w:sz w:val="48"/>
-          <w:szCs w:val="48"/>
+          <w:sz w:val="40"/>
+          <w:szCs w:val="40"/>
         </w:rPr>
         <w:t xml:space="preserve"> information</w:t>
       </w:r>
@@ -248,10 +441,14 @@
         <w:gridCol w:w="3040"/>
       </w:tblGrid>
       <w:tr>
+        <w:trPr>
+          <w:trHeight w:val="836"/>
+        </w:trPr>
         <w:tc>
           <w:tcPr>
             <w:tcW w:w="2292" w:type="dxa"/>
-            <w:shd w:val="clear" w:color="auto" w:fill="A5C9EB" w:themeFill="text2" w:themeFillTint="40"/>
+            <w:shd w:val="clear" w:color="auto" w:fill="0A2F41" w:themeFill="accent1" w:themeFillShade="80"/>
+            <w:vAlign w:val="bottom"/>
           </w:tcPr>
           <w:p>
             <w:pPr>
@@ -262,9 +459,9 @@
                 <w:rFonts w:ascii="Consolas" w:hAnsi="Consolas"/>
                 <w:b/>
                 <w:bCs/>
-                <w:color w:val="0E2841" w:themeColor="text2"/>
-                <w:sz w:val="40"/>
-                <w:szCs w:val="40"/>
+                <w:color w:val="auto"/>
+                <w:sz w:val="36"/>
+                <w:szCs w:val="36"/>
               </w:rPr>
             </w:pPr>
             <w:r>
@@ -272,9 +469,9 @@
                 <w:rFonts w:ascii="Consolas" w:hAnsi="Consolas"/>
                 <w:b/>
                 <w:bCs/>
-                <w:color w:val="0E2841" w:themeColor="text2"/>
-                <w:sz w:val="40"/>
-                <w:szCs w:val="40"/>
+                <w:color w:val="auto"/>
+                <w:sz w:val="36"/>
+                <w:szCs w:val="36"/>
               </w:rPr>
               <w:t>ID</w:t>
             </w:r>
@@ -283,7 +480,8 @@
         <w:tc>
           <w:tcPr>
             <w:tcW w:w="3715" w:type="dxa"/>
-            <w:shd w:val="clear" w:color="auto" w:fill="A5C9EB" w:themeFill="text2" w:themeFillTint="40"/>
+            <w:shd w:val="clear" w:color="auto" w:fill="0A2F41" w:themeFill="accent1" w:themeFillShade="80"/>
+            <w:vAlign w:val="bottom"/>
           </w:tcPr>
           <w:p>
             <w:pPr>
@@ -294,9 +492,9 @@
                 <w:rFonts w:ascii="Consolas" w:hAnsi="Consolas"/>
                 <w:b/>
                 <w:bCs/>
-                <w:color w:val="0E2841" w:themeColor="text2"/>
-                <w:sz w:val="40"/>
-                <w:szCs w:val="40"/>
+                <w:color w:val="auto"/>
+                <w:sz w:val="36"/>
+                <w:szCs w:val="36"/>
                 <w:rtl/>
                 <w:lang w:bidi="ar-EG"/>
               </w:rPr>
@@ -306,9 +504,9 @@
                 <w:rFonts w:ascii="Consolas" w:hAnsi="Consolas"/>
                 <w:b/>
                 <w:bCs/>
-                <w:color w:val="0E2841" w:themeColor="text2"/>
-                <w:sz w:val="40"/>
-                <w:szCs w:val="40"/>
+                <w:color w:val="auto"/>
+                <w:sz w:val="36"/>
+                <w:szCs w:val="36"/>
                 <w:lang w:bidi="ar-EG"/>
               </w:rPr>
               <w:t>Name</w:t>
@@ -318,7 +516,8 @@
         <w:tc>
           <w:tcPr>
             <w:tcW w:w="3040" w:type="dxa"/>
-            <w:shd w:val="clear" w:color="auto" w:fill="A5C9EB" w:themeFill="text2" w:themeFillTint="40"/>
+            <w:shd w:val="clear" w:color="auto" w:fill="0A2F41" w:themeFill="accent1" w:themeFillShade="80"/>
+            <w:vAlign w:val="bottom"/>
           </w:tcPr>
           <w:p>
             <w:pPr>
@@ -329,9 +528,9 @@
                 <w:rFonts w:ascii="Consolas" w:hAnsi="Consolas"/>
                 <w:b/>
                 <w:bCs/>
-                <w:color w:val="0E2841" w:themeColor="text2"/>
-                <w:sz w:val="40"/>
-                <w:szCs w:val="40"/>
+                <w:color w:val="auto"/>
+                <w:sz w:val="36"/>
+                <w:szCs w:val="36"/>
                 <w:lang w:bidi="ar-EG"/>
               </w:rPr>
             </w:pPr>
@@ -340,9 +539,9 @@
                 <w:rFonts w:ascii="Consolas" w:hAnsi="Consolas"/>
                 <w:b/>
                 <w:bCs/>
-                <w:color w:val="0E2841" w:themeColor="text2"/>
-                <w:sz w:val="40"/>
-                <w:szCs w:val="40"/>
+                <w:color w:val="auto"/>
+                <w:sz w:val="36"/>
+                <w:szCs w:val="36"/>
                 <w:lang w:bidi="ar-EG"/>
               </w:rPr>
               <w:t>Lab</w:t>
@@ -354,6 +553,7 @@
         <w:tc>
           <w:tcPr>
             <w:tcW w:w="2292" w:type="dxa"/>
+            <w:vAlign w:val="center"/>
           </w:tcPr>
           <w:p>
             <w:pPr>
@@ -362,17 +562,17 @@
               <w:jc w:val="center"/>
               <w:rPr>
                 <w:rFonts w:ascii="Consolas" w:hAnsi="Consolas"/>
-                <w:color w:val="0E2841" w:themeColor="text2"/>
-                <w:sz w:val="40"/>
-                <w:szCs w:val="40"/>
+                <w:color w:val="0A2F41" w:themeColor="accent1" w:themeShade="80"/>
+                <w:sz w:val="36"/>
+                <w:szCs w:val="36"/>
               </w:rPr>
             </w:pPr>
             <w:r>
               <w:rPr>
                 <w:rFonts w:ascii="Consolas" w:hAnsi="Consolas"/>
-                <w:color w:val="0E2841" w:themeColor="text2"/>
-                <w:sz w:val="40"/>
-                <w:szCs w:val="40"/>
+                <w:color w:val="0A2F41" w:themeColor="accent1" w:themeShade="80"/>
+                <w:sz w:val="36"/>
+                <w:szCs w:val="36"/>
               </w:rPr>
               <w:t>20231037</w:t>
             </w:r>
@@ -381,6 +581,7 @@
         <w:tc>
           <w:tcPr>
             <w:tcW w:w="3715" w:type="dxa"/>
+            <w:vAlign w:val="center"/>
           </w:tcPr>
           <w:p>
             <w:pPr>
@@ -389,17 +590,17 @@
               <w:jc w:val="center"/>
               <w:rPr>
                 <w:rFonts w:ascii="Consolas" w:hAnsi="Consolas"/>
-                <w:color w:val="0E2841" w:themeColor="text2"/>
-                <w:sz w:val="40"/>
-                <w:szCs w:val="40"/>
+                <w:color w:val="0A2F41" w:themeColor="accent1" w:themeShade="80"/>
+                <w:sz w:val="36"/>
+                <w:szCs w:val="36"/>
               </w:rPr>
             </w:pPr>
             <w:r>
               <w:rPr>
                 <w:rFonts w:ascii="Consolas" w:hAnsi="Consolas"/>
-                <w:color w:val="0E2841" w:themeColor="text2"/>
-                <w:sz w:val="40"/>
-                <w:szCs w:val="40"/>
+                <w:color w:val="0A2F41" w:themeColor="accent1" w:themeShade="80"/>
+                <w:sz w:val="36"/>
+                <w:szCs w:val="36"/>
               </w:rPr>
               <w:t>Bassant Tarek</w:t>
             </w:r>
@@ -408,6 +609,7 @@
         <w:tc>
           <w:tcPr>
             <w:tcW w:w="3040" w:type="dxa"/>
+            <w:vAlign w:val="center"/>
           </w:tcPr>
           <w:p>
             <w:pPr>
@@ -416,17 +618,17 @@
               <w:jc w:val="center"/>
               <w:rPr>
                 <w:rFonts w:ascii="Consolas" w:hAnsi="Consolas"/>
-                <w:color w:val="0E2841" w:themeColor="text2"/>
-                <w:sz w:val="40"/>
-                <w:szCs w:val="40"/>
+                <w:color w:val="0A2F41" w:themeColor="accent1" w:themeShade="80"/>
+                <w:sz w:val="36"/>
+                <w:szCs w:val="36"/>
               </w:rPr>
             </w:pPr>
             <w:r>
               <w:rPr>
                 <w:rFonts w:ascii="Consolas" w:hAnsi="Consolas"/>
-                <w:color w:val="0E2841" w:themeColor="text2"/>
-                <w:sz w:val="40"/>
-                <w:szCs w:val="40"/>
+                <w:color w:val="0A2F41" w:themeColor="accent1" w:themeShade="80"/>
+                <w:sz w:val="36"/>
+                <w:szCs w:val="36"/>
               </w:rPr>
               <w:t>S3,4</w:t>
             </w:r>
@@ -437,6 +639,7 @@
         <w:tc>
           <w:tcPr>
             <w:tcW w:w="2292" w:type="dxa"/>
+            <w:vAlign w:val="center"/>
           </w:tcPr>
           <w:p>
             <w:pPr>
@@ -445,17 +648,17 @@
               <w:jc w:val="center"/>
               <w:rPr>
                 <w:rFonts w:ascii="Consolas" w:hAnsi="Consolas"/>
-                <w:color w:val="0E2841" w:themeColor="text2"/>
-                <w:sz w:val="40"/>
-                <w:szCs w:val="40"/>
+                <w:color w:val="0A2F41" w:themeColor="accent1" w:themeShade="80"/>
+                <w:sz w:val="36"/>
+                <w:szCs w:val="36"/>
               </w:rPr>
             </w:pPr>
             <w:r>
               <w:rPr>
                 <w:rFonts w:ascii="Consolas" w:hAnsi="Consolas"/>
-                <w:color w:val="0E2841" w:themeColor="text2"/>
-                <w:sz w:val="40"/>
-                <w:szCs w:val="40"/>
+                <w:color w:val="0A2F41" w:themeColor="accent1" w:themeShade="80"/>
+                <w:sz w:val="36"/>
+                <w:szCs w:val="36"/>
               </w:rPr>
               <w:t>20231056</w:t>
             </w:r>
@@ -464,6 +667,7 @@
         <w:tc>
           <w:tcPr>
             <w:tcW w:w="3715" w:type="dxa"/>
+            <w:vAlign w:val="center"/>
           </w:tcPr>
           <w:p>
             <w:pPr>
@@ -472,17 +676,17 @@
               <w:jc w:val="center"/>
               <w:rPr>
                 <w:rFonts w:ascii="Consolas" w:hAnsi="Consolas"/>
-                <w:color w:val="0E2841" w:themeColor="text2"/>
-                <w:sz w:val="40"/>
-                <w:szCs w:val="40"/>
+                <w:color w:val="0A2F41" w:themeColor="accent1" w:themeShade="80"/>
+                <w:sz w:val="36"/>
+                <w:szCs w:val="36"/>
               </w:rPr>
             </w:pPr>
             <w:r>
               <w:rPr>
                 <w:rFonts w:ascii="Consolas" w:hAnsi="Consolas"/>
-                <w:color w:val="0E2841" w:themeColor="text2"/>
-                <w:sz w:val="40"/>
-                <w:szCs w:val="40"/>
+                <w:color w:val="0A2F41" w:themeColor="accent1" w:themeShade="80"/>
+                <w:sz w:val="36"/>
+                <w:szCs w:val="36"/>
               </w:rPr>
               <w:t>Rahma Bahgat</w:t>
             </w:r>
@@ -491,6 +695,7 @@
         <w:tc>
           <w:tcPr>
             <w:tcW w:w="3040" w:type="dxa"/>
+            <w:vAlign w:val="center"/>
           </w:tcPr>
           <w:p>
             <w:pPr>
@@ -499,17 +704,17 @@
               <w:jc w:val="center"/>
               <w:rPr>
                 <w:rFonts w:ascii="Consolas" w:hAnsi="Consolas"/>
-                <w:color w:val="0E2841" w:themeColor="text2"/>
-                <w:sz w:val="40"/>
-                <w:szCs w:val="40"/>
+                <w:color w:val="0A2F41" w:themeColor="accent1" w:themeShade="80"/>
+                <w:sz w:val="36"/>
+                <w:szCs w:val="36"/>
               </w:rPr>
             </w:pPr>
             <w:r>
               <w:rPr>
                 <w:rFonts w:ascii="Consolas" w:hAnsi="Consolas"/>
-                <w:color w:val="0E2841" w:themeColor="text2"/>
-                <w:sz w:val="40"/>
-                <w:szCs w:val="40"/>
+                <w:color w:val="0A2F41" w:themeColor="accent1" w:themeShade="80"/>
+                <w:sz w:val="36"/>
+                <w:szCs w:val="36"/>
               </w:rPr>
               <w:t>S3,4</w:t>
             </w:r>
@@ -520,6 +725,7 @@
         <w:tc>
           <w:tcPr>
             <w:tcW w:w="2292" w:type="dxa"/>
+            <w:vAlign w:val="center"/>
           </w:tcPr>
           <w:p>
             <w:pPr>
@@ -528,17 +734,17 @@
               <w:jc w:val="center"/>
               <w:rPr>
                 <w:rFonts w:ascii="Consolas" w:hAnsi="Consolas"/>
-                <w:color w:val="0E2841" w:themeColor="text2"/>
-                <w:sz w:val="40"/>
-                <w:szCs w:val="40"/>
+                <w:color w:val="0A2F41" w:themeColor="accent1" w:themeShade="80"/>
+                <w:sz w:val="36"/>
+                <w:szCs w:val="36"/>
               </w:rPr>
             </w:pPr>
             <w:r>
               <w:rPr>
                 <w:rFonts w:ascii="Consolas" w:hAnsi="Consolas"/>
-                <w:color w:val="0E2841" w:themeColor="text2"/>
-                <w:sz w:val="40"/>
-                <w:szCs w:val="40"/>
+                <w:color w:val="0A2F41" w:themeColor="accent1" w:themeShade="80"/>
+                <w:sz w:val="36"/>
+                <w:szCs w:val="36"/>
               </w:rPr>
               <w:t>20231067</w:t>
             </w:r>
@@ -547,6 +753,7 @@
         <w:tc>
           <w:tcPr>
             <w:tcW w:w="3715" w:type="dxa"/>
+            <w:vAlign w:val="center"/>
           </w:tcPr>
           <w:p>
             <w:pPr>
@@ -555,19 +762,20 @@
               <w:jc w:val="center"/>
               <w:rPr>
                 <w:rFonts w:ascii="Consolas" w:hAnsi="Consolas"/>
-                <w:color w:val="0E2841" w:themeColor="text2"/>
-                <w:sz w:val="40"/>
-                <w:szCs w:val="40"/>
+                <w:color w:val="0A2F41" w:themeColor="accent1" w:themeShade="80"/>
+                <w:sz w:val="36"/>
+                <w:szCs w:val="36"/>
               </w:rPr>
             </w:pPr>
-            <w:hyperlink r:id="rId8" w:history="1">
+            <w:hyperlink r:id="rId11" w:history="1">
               <w:r>
                 <w:rPr>
                   <w:rStyle w:val="Hyperlink"/>
                   <w:rFonts w:ascii="Consolas" w:hAnsi="Consolas"/>
-                  <w:color w:val="0E2841" w:themeColor="text2"/>
-                  <w:sz w:val="40"/>
-                  <w:szCs w:val="40"/>
+                  <w:color w:val="0A2F41" w:themeColor="accent1" w:themeShade="80"/>
+                  <w:sz w:val="36"/>
+                  <w:szCs w:val="36"/>
+                  <w:u w:val="none"/>
                 </w:rPr>
                 <w:t>Rawda</w:t>
               </w:r>
@@ -575,9 +783,9 @@
             <w:r>
               <w:rPr>
                 <w:rFonts w:ascii="Consolas" w:hAnsi="Consolas"/>
-                <w:color w:val="0E2841" w:themeColor="text2"/>
-                <w:sz w:val="40"/>
-                <w:szCs w:val="40"/>
+                <w:color w:val="0A2F41" w:themeColor="accent1" w:themeShade="80"/>
+                <w:sz w:val="36"/>
+                <w:szCs w:val="36"/>
               </w:rPr>
               <w:t xml:space="preserve"> Raafat</w:t>
             </w:r>
@@ -586,6 +794,7 @@
         <w:tc>
           <w:tcPr>
             <w:tcW w:w="3040" w:type="dxa"/>
+            <w:vAlign w:val="center"/>
           </w:tcPr>
           <w:p>
             <w:pPr>
@@ -594,17 +803,17 @@
               <w:jc w:val="center"/>
               <w:rPr>
                 <w:rFonts w:ascii="Consolas" w:hAnsi="Consolas"/>
-                <w:color w:val="0E2841" w:themeColor="text2"/>
-                <w:sz w:val="40"/>
-                <w:szCs w:val="40"/>
+                <w:color w:val="0A2F41" w:themeColor="accent1" w:themeShade="80"/>
+                <w:sz w:val="36"/>
+                <w:szCs w:val="36"/>
               </w:rPr>
             </w:pPr>
             <w:r>
               <w:rPr>
                 <w:rFonts w:ascii="Consolas" w:hAnsi="Consolas"/>
-                <w:color w:val="0E2841" w:themeColor="text2"/>
-                <w:sz w:val="40"/>
-                <w:szCs w:val="40"/>
+                <w:color w:val="0A2F41" w:themeColor="accent1" w:themeShade="80"/>
+                <w:sz w:val="36"/>
+                <w:szCs w:val="36"/>
               </w:rPr>
               <w:t>S3,4</w:t>
             </w:r>
@@ -615,6 +824,7 @@
         <w:tc>
           <w:tcPr>
             <w:tcW w:w="2292" w:type="dxa"/>
+            <w:vAlign w:val="center"/>
           </w:tcPr>
           <w:p>
             <w:pPr>
@@ -623,17 +833,17 @@
               <w:jc w:val="center"/>
               <w:rPr>
                 <w:rFonts w:ascii="Consolas" w:hAnsi="Consolas"/>
-                <w:color w:val="0E2841" w:themeColor="text2"/>
-                <w:sz w:val="40"/>
-                <w:szCs w:val="40"/>
+                <w:color w:val="0A2F41" w:themeColor="accent1" w:themeShade="80"/>
+                <w:sz w:val="36"/>
+                <w:szCs w:val="36"/>
               </w:rPr>
             </w:pPr>
             <w:r>
               <w:rPr>
                 <w:rFonts w:ascii="Consolas" w:hAnsi="Consolas"/>
-                <w:color w:val="0E2841" w:themeColor="text2"/>
-                <w:sz w:val="40"/>
-                <w:szCs w:val="40"/>
+                <w:color w:val="0A2F41" w:themeColor="accent1" w:themeShade="80"/>
+                <w:sz w:val="36"/>
+                <w:szCs w:val="36"/>
               </w:rPr>
               <w:t>20231160</w:t>
             </w:r>
@@ -642,6 +852,7 @@
         <w:tc>
           <w:tcPr>
             <w:tcW w:w="3715" w:type="dxa"/>
+            <w:vAlign w:val="center"/>
           </w:tcPr>
           <w:p>
             <w:pPr>
@@ -650,17 +861,17 @@
               <w:jc w:val="center"/>
               <w:rPr>
                 <w:rFonts w:ascii="Consolas" w:hAnsi="Consolas"/>
-                <w:color w:val="0E2841" w:themeColor="text2"/>
-                <w:sz w:val="40"/>
-                <w:szCs w:val="40"/>
+                <w:color w:val="0A2F41" w:themeColor="accent1" w:themeShade="80"/>
+                <w:sz w:val="36"/>
+                <w:szCs w:val="36"/>
               </w:rPr>
             </w:pPr>
             <w:r>
               <w:rPr>
                 <w:rFonts w:ascii="Consolas" w:hAnsi="Consolas"/>
-                <w:color w:val="0E2841" w:themeColor="text2"/>
-                <w:sz w:val="40"/>
-                <w:szCs w:val="40"/>
+                <w:color w:val="0A2F41" w:themeColor="accent1" w:themeShade="80"/>
+                <w:sz w:val="36"/>
+                <w:szCs w:val="36"/>
               </w:rPr>
               <w:t>Mariam Ehab</w:t>
             </w:r>
@@ -669,6 +880,7 @@
         <w:tc>
           <w:tcPr>
             <w:tcW w:w="3040" w:type="dxa"/>
+            <w:vAlign w:val="center"/>
           </w:tcPr>
           <w:p>
             <w:pPr>
@@ -677,17 +889,17 @@
               <w:jc w:val="center"/>
               <w:rPr>
                 <w:rFonts w:ascii="Consolas" w:hAnsi="Consolas"/>
-                <w:color w:val="0E2841" w:themeColor="text2"/>
-                <w:sz w:val="40"/>
-                <w:szCs w:val="40"/>
+                <w:color w:val="0A2F41" w:themeColor="accent1" w:themeShade="80"/>
+                <w:sz w:val="36"/>
+                <w:szCs w:val="36"/>
               </w:rPr>
             </w:pPr>
             <w:r>
               <w:rPr>
                 <w:rFonts w:ascii="Consolas" w:hAnsi="Consolas"/>
-                <w:color w:val="0E2841" w:themeColor="text2"/>
-                <w:sz w:val="40"/>
-                <w:szCs w:val="40"/>
+                <w:color w:val="0A2F41" w:themeColor="accent1" w:themeShade="80"/>
+                <w:sz w:val="36"/>
+                <w:szCs w:val="36"/>
               </w:rPr>
               <w:t>S3,4</w:t>
             </w:r>
@@ -702,8 +914,8 @@
         <w:rPr>
           <w:rFonts w:ascii="Consolas" w:hAnsi="Consolas"/>
           <w:color w:val="0E2841" w:themeColor="text2"/>
-          <w:sz w:val="40"/>
-          <w:szCs w:val="40"/>
+          <w:sz w:val="48"/>
+          <w:szCs w:val="48"/>
         </w:rPr>
       </w:pPr>
       <w:r>
@@ -727,38 +939,25 @@
           <w:szCs w:val="40"/>
         </w:rPr>
       </w:pPr>
-    </w:p>
-    <w:p>
-      <w:pPr>
-        <w:spacing w:after="203" w:line="259" w:lineRule="auto"/>
-        <w:ind w:firstLine="0"/>
-        <w:rPr>
-          <w:rFonts w:ascii="Consolas" w:hAnsi="Consolas"/>
-          <w:color w:val="0E2841" w:themeColor="text2"/>
-          <w:sz w:val="48"/>
-          <w:szCs w:val="48"/>
-        </w:rPr>
-      </w:pPr>
       <w:r>
         <w:rPr>
           <w:rFonts w:ascii="Consolas" w:hAnsi="Consolas"/>
           <w:b/>
           <w:bCs/>
           <w:color w:val="0E2841" w:themeColor="text2"/>
-          <w:sz w:val="48"/>
-          <w:szCs w:val="48"/>
+          <w:sz w:val="40"/>
+          <w:szCs w:val="40"/>
         </w:rPr>
         <w:t xml:space="preserve">Drive </w:t>
       </w:r>
-      <w:proofErr w:type="gramStart"/>
       <w:r>
         <w:rPr>
           <w:rFonts w:ascii="Consolas" w:hAnsi="Consolas"/>
           <w:b/>
           <w:bCs/>
           <w:color w:val="0E2841" w:themeColor="text2"/>
-          <w:sz w:val="48"/>
-          <w:szCs w:val="48"/>
+          <w:sz w:val="40"/>
+          <w:szCs w:val="40"/>
         </w:rPr>
         <w:t>link</w:t>
       </w:r>
@@ -766,42 +965,117 @@
         <w:rPr>
           <w:rFonts w:ascii="Consolas" w:hAnsi="Consolas"/>
           <w:color w:val="0E2841" w:themeColor="text2"/>
-          <w:sz w:val="48"/>
-          <w:szCs w:val="48"/>
-        </w:rPr>
-        <w:t xml:space="preserve"> :</w:t>
+          <w:sz w:val="40"/>
+          <w:szCs w:val="40"/>
+        </w:rPr>
+        <w:t>:</w:t>
       </w:r>
-      <w:proofErr w:type="gramEnd"/>
       <w:r>
         <w:rPr>
           <w:rFonts w:ascii="Consolas" w:hAnsi="Consolas"/>
           <w:color w:val="0E2841" w:themeColor="text2"/>
-          <w:sz w:val="48"/>
-          <w:szCs w:val="48"/>
+          <w:sz w:val="40"/>
+          <w:szCs w:val="40"/>
         </w:rPr>
         <w:t xml:space="preserve"> </w:t>
       </w:r>
-      <w:hyperlink r:id="rId9" w:history="1">
+      <w:hyperlink r:id="rId12" w:history="1">
         <w:r>
           <w:rPr>
             <w:rStyle w:val="Hyperlink"/>
             <w:rFonts w:ascii="Consolas" w:hAnsi="Consolas"/>
             <w:color w:val="0E2841" w:themeColor="text2"/>
-            <w:sz w:val="48"/>
-            <w:szCs w:val="48"/>
+            <w:sz w:val="40"/>
+            <w:szCs w:val="40"/>
           </w:rPr>
-          <w:t xml:space="preserve">click here </w:t>
+          <w:t>cli</w:t>
+        </w:r>
+        <w:r>
+          <w:rPr>
+            <w:rStyle w:val="Hyperlink"/>
+            <w:rFonts w:ascii="Consolas" w:hAnsi="Consolas"/>
+            <w:color w:val="0E2841" w:themeColor="text2"/>
+            <w:sz w:val="40"/>
+            <w:szCs w:val="40"/>
+          </w:rPr>
+          <w:t>c</w:t>
+        </w:r>
+        <w:r>
+          <w:rPr>
+            <w:rStyle w:val="Hyperlink"/>
+            <w:rFonts w:ascii="Consolas" w:hAnsi="Consolas"/>
+            <w:color w:val="0E2841" w:themeColor="text2"/>
+            <w:sz w:val="40"/>
+            <w:szCs w:val="40"/>
+          </w:rPr>
+          <w:t xml:space="preserve">k here </w:t>
         </w:r>
       </w:hyperlink>
     </w:p>
     <w:sectPr>
       <w:pgSz w:w="12240" w:h="15840"/>
       <w:pgMar w:top="1440" w:right="1440" w:bottom="1440" w:left="1440" w:header="720" w:footer="720" w:gutter="0"/>
+      <w:pgBorders w:offsetFrom="page">
+        <w:top w:val="single" w:sz="4" w:space="24" w:color="auto"/>
+        <w:left w:val="single" w:sz="4" w:space="24" w:color="auto"/>
+        <w:bottom w:val="single" w:sz="4" w:space="24" w:color="auto"/>
+        <w:right w:val="single" w:sz="4" w:space="24" w:color="auto"/>
+      </w:pgBorders>
       <w:cols w:space="720"/>
       <w:docGrid w:linePitch="360"/>
     </w:sectPr>
   </w:body>
 </w:document>
+</file>
+
+<file path=word/endnotes.xml><?xml version="1.0" encoding="utf-8"?>
+<w:endnotes xmlns:wpc="http://schemas.microsoft.com/office/word/2010/wordprocessingCanvas" xmlns:cx="http://schemas.microsoft.com/office/drawing/2014/chartex" xmlns:cx1="http://schemas.microsoft.com/office/drawing/2015/9/8/chartex" xmlns:cx2="http://schemas.microsoft.com/office/drawing/2015/10/21/chartex" xmlns:cx3="http://schemas.microsoft.com/office/drawing/2016/5/9/chartex" xmlns:cx4="http://schemas.microsoft.com/office/drawing/2016/5/10/chartex" xmlns:cx5="http://schemas.microsoft.com/office/drawing/2016/5/11/chartex" xmlns:cx6="http://schemas.microsoft.com/office/drawing/2016/5/12/chartex" xmlns:cx7="http://schemas.microsoft.com/office/drawing/2016/5/13/chartex" xmlns:cx8="http://schemas.microsoft.com/office/drawing/2016/5/14/chartex" xmlns:mc="http://schemas.openxmlformats.org/markup-compatibility/2006" xmlns:aink="http://schemas.microsoft.com/office/drawing/2016/ink" xmlns:am3d="http://schemas.microsoft.com/office/drawing/2017/model3d" xmlns:o="urn:schemas-microsoft-com:office:office" xmlns:oel="http://schemas.microsoft.com/office/2019/extlst" xmlns:r="http://schemas.openxmlformats.org/officeDocument/2006/relationships" xmlns:m="http://schemas.openxmlformats.org/officeDocument/2006/math" xmlns:v="urn:schemas-microsoft-com:vml" xmlns:wp14="http://schemas.microsoft.com/office/word/2010/wordprocessingDrawing" xmlns:wp="http://schemas.openxmlformats.org/drawingml/2006/wordprocessingDrawing" xmlns:w10="urn:schemas-microsoft-com:office:word" xmlns:w="http://schemas.openxmlformats.org/wordprocessingml/2006/main" xmlns:w14="http://schemas.microsoft.com/office/word/2010/wordml" xmlns:w15="http://schemas.microsoft.com/office/word/2012/wordml" xmlns:w16cex="http://schemas.microsoft.com/office/word/2018/wordml/cex" xmlns:w16cid="http://schemas.microsoft.com/office/word/2016/wordml/cid" xmlns:w16="http://schemas.microsoft.com/office/word/2018/wordml" xmlns:w16du="http://schemas.microsoft.com/office/word/2023/wordml/word16du" xmlns:w16sdtdh="http://schemas.microsoft.com/office/word/2020/wordml/sdtdatahash" xmlns:w16sdtfl="http://schemas.microsoft.com/office/word/2024/wordml/sdtformatlock" xmlns:w16se="http://schemas.microsoft.com/office/word/2015/wordml/symex" xmlns:wpg="http://schemas.microsoft.com/office/word/2010/wordprocessingGroup" xmlns:wpi="http://schemas.microsoft.com/office/word/2010/wordprocessingInk" xmlns:wne="http://schemas.microsoft.com/office/word/2006/wordml" xmlns:wps="http://schemas.microsoft.com/office/word/2010/wordprocessingShape" mc:Ignorable="w14 w15 w16se w16cid w16 w16cex w16sdtdh w16sdtfl w16du wp14">
+  <w:endnote w:type="separator" w:id="-1">
+    <w:p>
+      <w:pPr>
+        <w:spacing w:line="240" w:lineRule="auto"/>
+      </w:pPr>
+      <w:r>
+        <w:separator/>
+      </w:r>
+    </w:p>
+  </w:endnote>
+  <w:endnote w:type="continuationSeparator" w:id="0">
+    <w:p>
+      <w:pPr>
+        <w:spacing w:line="240" w:lineRule="auto"/>
+      </w:pPr>
+      <w:r>
+        <w:continuationSeparator/>
+      </w:r>
+    </w:p>
+  </w:endnote>
+</w:endnotes>
+</file>
+
+<file path=word/footnotes.xml><?xml version="1.0" encoding="utf-8"?>
+<w:footnotes xmlns:wpc="http://schemas.microsoft.com/office/word/2010/wordprocessingCanvas" xmlns:cx="http://schemas.microsoft.com/office/drawing/2014/chartex" xmlns:cx1="http://schemas.microsoft.com/office/drawing/2015/9/8/chartex" xmlns:cx2="http://schemas.microsoft.com/office/drawing/2015/10/21/chartex" xmlns:cx3="http://schemas.microsoft.com/office/drawing/2016/5/9/chartex" xmlns:cx4="http://schemas.microsoft.com/office/drawing/2016/5/10/chartex" xmlns:cx5="http://schemas.microsoft.com/office/drawing/2016/5/11/chartex" xmlns:cx6="http://schemas.microsoft.com/office/drawing/2016/5/12/chartex" xmlns:cx7="http://schemas.microsoft.com/office/drawing/2016/5/13/chartex" xmlns:cx8="http://schemas.microsoft.com/office/drawing/2016/5/14/chartex" xmlns:mc="http://schemas.openxmlformats.org/markup-compatibility/2006" xmlns:aink="http://schemas.microsoft.com/office/drawing/2016/ink" xmlns:am3d="http://schemas.microsoft.com/office/drawing/2017/model3d" xmlns:o="urn:schemas-microsoft-com:office:office" xmlns:oel="http://schemas.microsoft.com/office/2019/extlst" xmlns:r="http://schemas.openxmlformats.org/officeDocument/2006/relationships" xmlns:m="http://schemas.openxmlformats.org/officeDocument/2006/math" xmlns:v="urn:schemas-microsoft-com:vml" xmlns:wp14="http://schemas.microsoft.com/office/word/2010/wordprocessingDrawing" xmlns:wp="http://schemas.openxmlformats.org/drawingml/2006/wordprocessingDrawing" xmlns:w10="urn:schemas-microsoft-com:office:word" xmlns:w="http://schemas.openxmlformats.org/wordprocessingml/2006/main" xmlns:w14="http://schemas.microsoft.com/office/word/2010/wordml" xmlns:w15="http://schemas.microsoft.com/office/word/2012/wordml" xmlns:w16cex="http://schemas.microsoft.com/office/word/2018/wordml/cex" xmlns:w16cid="http://schemas.microsoft.com/office/word/2016/wordml/cid" xmlns:w16="http://schemas.microsoft.com/office/word/2018/wordml" xmlns:w16du="http://schemas.microsoft.com/office/word/2023/wordml/word16du" xmlns:w16sdtdh="http://schemas.microsoft.com/office/word/2020/wordml/sdtdatahash" xmlns:w16sdtfl="http://schemas.microsoft.com/office/word/2024/wordml/sdtformatlock" xmlns:w16se="http://schemas.microsoft.com/office/word/2015/wordml/symex" xmlns:wpg="http://schemas.microsoft.com/office/word/2010/wordprocessingGroup" xmlns:wpi="http://schemas.microsoft.com/office/word/2010/wordprocessingInk" xmlns:wne="http://schemas.microsoft.com/office/word/2006/wordml" xmlns:wps="http://schemas.microsoft.com/office/word/2010/wordprocessingShape" mc:Ignorable="w14 w15 w16se w16cid w16 w16cex w16sdtdh w16sdtfl w16du wp14">
+  <w:footnote w:type="separator" w:id="-1">
+    <w:p>
+      <w:pPr>
+        <w:spacing w:after="0"/>
+      </w:pPr>
+      <w:r>
+        <w:separator/>
+      </w:r>
+    </w:p>
+  </w:footnote>
+  <w:footnote w:type="continuationSeparator" w:id="0">
+    <w:p>
+      <w:pPr>
+        <w:spacing w:after="0"/>
+      </w:pPr>
+      <w:r>
+        <w:continuationSeparator/>
+      </w:r>
+    </w:p>
+  </w:footnote>
+</w:footnotes>
 </file>
 
 <file path=word/styles.xml><?xml version="1.0" encoding="utf-8"?>
@@ -810,18 +1084,10 @@
     <w:rPrDefault>
       <w:rPr>
         <w:rFonts w:asciiTheme="minorHAnsi" w:eastAsiaTheme="minorHAnsi" w:hAnsiTheme="minorHAnsi" w:cstheme="minorBidi"/>
-        <w:kern w:val="2"/>
-        <w:sz w:val="24"/>
-        <w:szCs w:val="24"/>
-        <w:lang w:val="en-US" w:eastAsia="en-US" w:bidi="ar-SA"/>
-        <w14:ligatures w14:val="standardContextual"/>
+        <w:lang w:val="en-US" w:eastAsia="ja-JP" w:bidi="ar-SA"/>
       </w:rPr>
     </w:rPrDefault>
-    <w:pPrDefault>
-      <w:pPr>
-        <w:spacing w:after="160" w:line="278" w:lineRule="auto"/>
-      </w:pPr>
-    </w:pPrDefault>
+    <w:pPrDefault/>
   </w:docDefaults>
   <w:latentStyles w:defLockedState="0" w:defUIPriority="99" w:defSemiHidden="0" w:defUnhideWhenUsed="0" w:defQFormat="0" w:count="376">
     <w:lsdException w:name="Normal" w:uiPriority="0" w:qFormat="1"/>
@@ -889,7 +1155,7 @@
     <w:lsdException w:name="Title" w:uiPriority="10" w:qFormat="1"/>
     <w:lsdException w:name="Closing" w:semiHidden="1" w:unhideWhenUsed="1"/>
     <w:lsdException w:name="Signature" w:semiHidden="1" w:unhideWhenUsed="1"/>
-    <w:lsdException w:name="Default Paragraph Font" w:semiHidden="1" w:uiPriority="1" w:unhideWhenUsed="1"/>
+    <w:lsdException w:name="Default Paragraph Font" w:semiHidden="1" w:uiPriority="1" w:unhideWhenUsed="1" w:qFormat="1"/>
     <w:lsdException w:name="Body Text" w:semiHidden="1" w:unhideWhenUsed="1"/>
     <w:lsdException w:name="Body Text Indent" w:semiHidden="1" w:unhideWhenUsed="1"/>
     <w:lsdException w:name="List Continue" w:semiHidden="1" w:unhideWhenUsed="1"/>
@@ -909,8 +1175,8 @@
     <w:lsdException w:name="Body Text Indent 2" w:semiHidden="1" w:unhideWhenUsed="1"/>
     <w:lsdException w:name="Body Text Indent 3" w:semiHidden="1" w:unhideWhenUsed="1"/>
     <w:lsdException w:name="Block Text" w:semiHidden="1" w:unhideWhenUsed="1"/>
-    <w:lsdException w:name="Hyperlink" w:semiHidden="1" w:unhideWhenUsed="1"/>
-    <w:lsdException w:name="FollowedHyperlink" w:semiHidden="1" w:unhideWhenUsed="1"/>
+    <w:lsdException w:name="Hyperlink" w:unhideWhenUsed="1" w:qFormat="1"/>
+    <w:lsdException w:name="FollowedHyperlink" w:semiHidden="1" w:unhideWhenUsed="1" w:qFormat="1"/>
     <w:lsdException w:name="Strong" w:uiPriority="22" w:qFormat="1"/>
     <w:lsdException w:name="Emphasis" w:uiPriority="20" w:qFormat="1"/>
     <w:lsdException w:name="Document Map" w:semiHidden="1" w:unhideWhenUsed="1"/>
@@ -929,7 +1195,7 @@
     <w:lsdException w:name="HTML Sample" w:semiHidden="1" w:unhideWhenUsed="1"/>
     <w:lsdException w:name="HTML Typewriter" w:semiHidden="1" w:unhideWhenUsed="1"/>
     <w:lsdException w:name="HTML Variable" w:semiHidden="1" w:unhideWhenUsed="1"/>
-    <w:lsdException w:name="Normal Table" w:semiHidden="1" w:unhideWhenUsed="1"/>
+    <w:lsdException w:name="Normal Table" w:semiHidden="1" w:unhideWhenUsed="1" w:qFormat="1"/>
     <w:lsdException w:name="annotation subject" w:semiHidden="1" w:unhideWhenUsed="1"/>
     <w:lsdException w:name="No List" w:semiHidden="1" w:unhideWhenUsed="1"/>
     <w:lsdException w:name="Outline List 1" w:semiHidden="1" w:unhideWhenUsed="1"/>
@@ -978,10 +1244,10 @@
     <w:lsdException w:name="Table Web 2" w:semiHidden="1" w:unhideWhenUsed="1"/>
     <w:lsdException w:name="Table Web 3" w:semiHidden="1" w:unhideWhenUsed="1"/>
     <w:lsdException w:name="Balloon Text" w:semiHidden="1" w:unhideWhenUsed="1"/>
-    <w:lsdException w:name="Table Grid" w:uiPriority="39"/>
+    <w:lsdException w:name="Table Grid" w:uiPriority="39" w:qFormat="1"/>
     <w:lsdException w:name="Table Theme" w:semiHidden="1" w:unhideWhenUsed="1"/>
-    <w:lsdException w:name="Placeholder Text" w:semiHidden="1"/>
-    <w:lsdException w:name="No Spacing" w:uiPriority="1" w:qFormat="1"/>
+    <w:lsdException w:name="Placeholder Text" w:semiHidden="1" w:unhideWhenUsed="1"/>
+    <w:lsdException w:name="No Spacing" w:semiHidden="1" w:unhideWhenUsed="1"/>
     <w:lsdException w:name="Light Shading" w:uiPriority="60"/>
     <w:lsdException w:name="Light List" w:uiPriority="61"/>
     <w:lsdException w:name="Light Grid" w:uiPriority="62"/>
@@ -1002,7 +1268,7 @@
     <w:lsdException w:name="Medium Shading 1 Accent 1" w:uiPriority="63"/>
     <w:lsdException w:name="Medium Shading 2 Accent 1" w:uiPriority="64"/>
     <w:lsdException w:name="Medium List 1 Accent 1" w:uiPriority="65"/>
-    <w:lsdException w:name="Revision" w:semiHidden="1"/>
+    <w:lsdException w:name="Revision" w:semiHidden="1" w:unhideWhenUsed="1"/>
     <w:lsdException w:name="List Paragraph" w:uiPriority="34" w:qFormat="1"/>
     <w:lsdException w:name="Quote" w:uiPriority="29" w:qFormat="1"/>
     <w:lsdException w:name="Intense Quote" w:uiPriority="30" w:qFormat="1"/>
@@ -1204,7 +1470,6 @@
   <w:style w:type="paragraph" w:default="1" w:styleId="Normal">
     <w:name w:val="Normal"/>
     <w:qFormat/>
-    <w:rsid w:val="008D51C4"/>
     <w:pPr>
       <w:spacing w:after="10" w:line="270" w:lineRule="auto"/>
       <w:ind w:left="10" w:hanging="10"/>
@@ -1212,6 +1477,11 @@
     <w:rPr>
       <w:rFonts w:ascii="Calibri" w:eastAsia="Calibri" w:hAnsi="Calibri" w:cs="Calibri"/>
       <w:color w:val="000000"/>
+      <w:kern w:val="2"/>
+      <w:sz w:val="24"/>
+      <w:szCs w:val="24"/>
+      <w:lang w:eastAsia="en-US"/>
+      <w14:ligatures w14:val="standardContextual"/>
     </w:rPr>
   </w:style>
   <w:style w:type="paragraph" w:styleId="Heading1">
@@ -1221,7 +1491,6 @@
     <w:link w:val="Heading1Char"/>
     <w:uiPriority w:val="9"/>
     <w:qFormat/>
-    <w:rsid w:val="008D51C4"/>
     <w:pPr>
       <w:keepNext/>
       <w:keepLines/>
@@ -1244,7 +1513,6 @@
     <w:semiHidden/>
     <w:unhideWhenUsed/>
     <w:qFormat/>
-    <w:rsid w:val="008D51C4"/>
     <w:pPr>
       <w:keepNext/>
       <w:keepLines/>
@@ -1267,7 +1535,6 @@
     <w:semiHidden/>
     <w:unhideWhenUsed/>
     <w:qFormat/>
-    <w:rsid w:val="008D51C4"/>
     <w:pPr>
       <w:keepNext/>
       <w:keepLines/>
@@ -1290,7 +1557,6 @@
     <w:semiHidden/>
     <w:unhideWhenUsed/>
     <w:qFormat/>
-    <w:rsid w:val="008D51C4"/>
     <w:pPr>
       <w:keepNext/>
       <w:keepLines/>
@@ -1313,7 +1579,6 @@
     <w:semiHidden/>
     <w:unhideWhenUsed/>
     <w:qFormat/>
-    <w:rsid w:val="008D51C4"/>
     <w:pPr>
       <w:keepNext/>
       <w:keepLines/>
@@ -1334,7 +1599,6 @@
     <w:semiHidden/>
     <w:unhideWhenUsed/>
     <w:qFormat/>
-    <w:rsid w:val="008D51C4"/>
     <w:pPr>
       <w:keepNext/>
       <w:keepLines/>
@@ -1357,7 +1621,6 @@
     <w:semiHidden/>
     <w:unhideWhenUsed/>
     <w:qFormat/>
-    <w:rsid w:val="008D51C4"/>
     <w:pPr>
       <w:keepNext/>
       <w:keepLines/>
@@ -1378,7 +1641,6 @@
     <w:semiHidden/>
     <w:unhideWhenUsed/>
     <w:qFormat/>
-    <w:rsid w:val="008D51C4"/>
     <w:pPr>
       <w:keepNext/>
       <w:keepLines/>
@@ -1389,7 +1651,7 @@
       <w:rFonts w:eastAsiaTheme="majorEastAsia" w:cstheme="majorBidi"/>
       <w:i/>
       <w:iCs/>
-      <w:color w:val="272727" w:themeColor="text1" w:themeTint="D8"/>
+      <w:color w:val="262626" w:themeColor="text1" w:themeTint="D9"/>
     </w:rPr>
   </w:style>
   <w:style w:type="paragraph" w:styleId="Heading9">
@@ -1401,7 +1663,6 @@
     <w:semiHidden/>
     <w:unhideWhenUsed/>
     <w:qFormat/>
-    <w:rsid w:val="008D51C4"/>
     <w:pPr>
       <w:keepNext/>
       <w:keepLines/>
@@ -1410,13 +1671,12 @@
     </w:pPr>
     <w:rPr>
       <w:rFonts w:eastAsiaTheme="majorEastAsia" w:cstheme="majorBidi"/>
-      <w:color w:val="272727" w:themeColor="text1" w:themeTint="D8"/>
+      <w:color w:val="262626" w:themeColor="text1" w:themeTint="D9"/>
     </w:rPr>
   </w:style>
   <w:style w:type="character" w:default="1" w:styleId="DefaultParagraphFont">
     <w:name w:val="Default Paragraph Font"/>
     <w:uiPriority w:val="1"/>
-    <w:semiHidden/>
     <w:unhideWhenUsed/>
   </w:style>
   <w:style w:type="table" w:default="1" w:styleId="TableNormal">
@@ -1440,157 +1700,27 @@
     <w:semiHidden/>
     <w:unhideWhenUsed/>
   </w:style>
-  <w:style w:type="character" w:customStyle="1" w:styleId="Heading1Char">
-    <w:name w:val="Heading 1 Char"/>
+  <w:style w:type="character" w:styleId="FollowedHyperlink">
+    <w:name w:val="FollowedHyperlink"/>
     <w:basedOn w:val="DefaultParagraphFont"/>
-    <w:link w:val="Heading1"/>
-    <w:uiPriority w:val="9"/>
-    <w:rsid w:val="008D51C4"/>
-    <w:rPr>
-      <w:rFonts w:asciiTheme="majorHAnsi" w:eastAsiaTheme="majorEastAsia" w:hAnsiTheme="majorHAnsi" w:cstheme="majorBidi"/>
-      <w:color w:val="0F4761" w:themeColor="accent1" w:themeShade="BF"/>
-      <w:sz w:val="40"/>
-      <w:szCs w:val="40"/>
-    </w:rPr>
-  </w:style>
-  <w:style w:type="character" w:customStyle="1" w:styleId="Heading2Char">
-    <w:name w:val="Heading 2 Char"/>
+    <w:uiPriority w:val="99"/>
+    <w:semiHidden/>
+    <w:unhideWhenUsed/>
+    <w:qFormat/>
+    <w:rPr>
+      <w:color w:val="96607D" w:themeColor="followedHyperlink"/>
+      <w:u w:val="single"/>
+    </w:rPr>
+  </w:style>
+  <w:style w:type="character" w:styleId="Hyperlink">
+    <w:name w:val="Hyperlink"/>
     <w:basedOn w:val="DefaultParagraphFont"/>
-    <w:link w:val="Heading2"/>
-    <w:uiPriority w:val="9"/>
-    <w:semiHidden/>
-    <w:rsid w:val="008D51C4"/>
-    <w:rPr>
-      <w:rFonts w:asciiTheme="majorHAnsi" w:eastAsiaTheme="majorEastAsia" w:hAnsiTheme="majorHAnsi" w:cstheme="majorBidi"/>
-      <w:color w:val="0F4761" w:themeColor="accent1" w:themeShade="BF"/>
-      <w:sz w:val="32"/>
-      <w:szCs w:val="32"/>
-    </w:rPr>
-  </w:style>
-  <w:style w:type="character" w:customStyle="1" w:styleId="Heading3Char">
-    <w:name w:val="Heading 3 Char"/>
-    <w:basedOn w:val="DefaultParagraphFont"/>
-    <w:link w:val="Heading3"/>
-    <w:uiPriority w:val="9"/>
-    <w:semiHidden/>
-    <w:rsid w:val="008D51C4"/>
-    <w:rPr>
-      <w:rFonts w:eastAsiaTheme="majorEastAsia" w:cstheme="majorBidi"/>
-      <w:color w:val="0F4761" w:themeColor="accent1" w:themeShade="BF"/>
-      <w:sz w:val="28"/>
-      <w:szCs w:val="28"/>
-    </w:rPr>
-  </w:style>
-  <w:style w:type="character" w:customStyle="1" w:styleId="Heading4Char">
-    <w:name w:val="Heading 4 Char"/>
-    <w:basedOn w:val="DefaultParagraphFont"/>
-    <w:link w:val="Heading4"/>
-    <w:uiPriority w:val="9"/>
-    <w:semiHidden/>
-    <w:rsid w:val="008D51C4"/>
-    <w:rPr>
-      <w:rFonts w:eastAsiaTheme="majorEastAsia" w:cstheme="majorBidi"/>
-      <w:i/>
-      <w:iCs/>
-      <w:color w:val="0F4761" w:themeColor="accent1" w:themeShade="BF"/>
-    </w:rPr>
-  </w:style>
-  <w:style w:type="character" w:customStyle="1" w:styleId="Heading5Char">
-    <w:name w:val="Heading 5 Char"/>
-    <w:basedOn w:val="DefaultParagraphFont"/>
-    <w:link w:val="Heading5"/>
-    <w:uiPriority w:val="9"/>
-    <w:semiHidden/>
-    <w:rsid w:val="008D51C4"/>
-    <w:rPr>
-      <w:rFonts w:eastAsiaTheme="majorEastAsia" w:cstheme="majorBidi"/>
-      <w:color w:val="0F4761" w:themeColor="accent1" w:themeShade="BF"/>
-    </w:rPr>
-  </w:style>
-  <w:style w:type="character" w:customStyle="1" w:styleId="Heading6Char">
-    <w:name w:val="Heading 6 Char"/>
-    <w:basedOn w:val="DefaultParagraphFont"/>
-    <w:link w:val="Heading6"/>
-    <w:uiPriority w:val="9"/>
-    <w:semiHidden/>
-    <w:rsid w:val="008D51C4"/>
-    <w:rPr>
-      <w:rFonts w:eastAsiaTheme="majorEastAsia" w:cstheme="majorBidi"/>
-      <w:i/>
-      <w:iCs/>
-      <w:color w:val="595959" w:themeColor="text1" w:themeTint="A6"/>
-    </w:rPr>
-  </w:style>
-  <w:style w:type="character" w:customStyle="1" w:styleId="Heading7Char">
-    <w:name w:val="Heading 7 Char"/>
-    <w:basedOn w:val="DefaultParagraphFont"/>
-    <w:link w:val="Heading7"/>
-    <w:uiPriority w:val="9"/>
-    <w:semiHidden/>
-    <w:rsid w:val="008D51C4"/>
-    <w:rPr>
-      <w:rFonts w:eastAsiaTheme="majorEastAsia" w:cstheme="majorBidi"/>
-      <w:color w:val="595959" w:themeColor="text1" w:themeTint="A6"/>
-    </w:rPr>
-  </w:style>
-  <w:style w:type="character" w:customStyle="1" w:styleId="Heading8Char">
-    <w:name w:val="Heading 8 Char"/>
-    <w:basedOn w:val="DefaultParagraphFont"/>
-    <w:link w:val="Heading8"/>
-    <w:uiPriority w:val="9"/>
-    <w:semiHidden/>
-    <w:rsid w:val="008D51C4"/>
-    <w:rPr>
-      <w:rFonts w:eastAsiaTheme="majorEastAsia" w:cstheme="majorBidi"/>
-      <w:i/>
-      <w:iCs/>
-      <w:color w:val="272727" w:themeColor="text1" w:themeTint="D8"/>
-    </w:rPr>
-  </w:style>
-  <w:style w:type="character" w:customStyle="1" w:styleId="Heading9Char">
-    <w:name w:val="Heading 9 Char"/>
-    <w:basedOn w:val="DefaultParagraphFont"/>
-    <w:link w:val="Heading9"/>
-    <w:uiPriority w:val="9"/>
-    <w:semiHidden/>
-    <w:rsid w:val="008D51C4"/>
-    <w:rPr>
-      <w:rFonts w:eastAsiaTheme="majorEastAsia" w:cstheme="majorBidi"/>
-      <w:color w:val="272727" w:themeColor="text1" w:themeTint="D8"/>
-    </w:rPr>
-  </w:style>
-  <w:style w:type="paragraph" w:styleId="Title">
-    <w:name w:val="Title"/>
-    <w:basedOn w:val="Normal"/>
-    <w:next w:val="Normal"/>
-    <w:link w:val="TitleChar"/>
-    <w:uiPriority w:val="10"/>
-    <w:qFormat/>
-    <w:rsid w:val="008D51C4"/>
-    <w:pPr>
-      <w:spacing w:after="80" w:line="240" w:lineRule="auto"/>
-      <w:contextualSpacing/>
-    </w:pPr>
-    <w:rPr>
-      <w:rFonts w:asciiTheme="majorHAnsi" w:eastAsiaTheme="majorEastAsia" w:hAnsiTheme="majorHAnsi" w:cstheme="majorBidi"/>
-      <w:spacing w:val="-10"/>
-      <w:kern w:val="28"/>
-      <w:sz w:val="56"/>
-      <w:szCs w:val="56"/>
-    </w:rPr>
-  </w:style>
-  <w:style w:type="character" w:customStyle="1" w:styleId="TitleChar">
-    <w:name w:val="Title Char"/>
-    <w:basedOn w:val="DefaultParagraphFont"/>
-    <w:link w:val="Title"/>
-    <w:uiPriority w:val="10"/>
-    <w:rsid w:val="008D51C4"/>
-    <w:rPr>
-      <w:rFonts w:asciiTheme="majorHAnsi" w:eastAsiaTheme="majorEastAsia" w:hAnsiTheme="majorHAnsi" w:cstheme="majorBidi"/>
-      <w:spacing w:val="-10"/>
-      <w:kern w:val="28"/>
-      <w:sz w:val="56"/>
-      <w:szCs w:val="56"/>
+    <w:uiPriority w:val="99"/>
+    <w:unhideWhenUsed/>
+    <w:qFormat/>
+    <w:rPr>
+      <w:color w:val="467886" w:themeColor="hyperlink"/>
+      <w:u w:val="single"/>
     </w:rPr>
   </w:style>
   <w:style w:type="paragraph" w:styleId="Subtitle">
@@ -1600,12 +1730,6 @@
     <w:link w:val="SubtitleChar"/>
     <w:uiPriority w:val="11"/>
     <w:qFormat/>
-    <w:rsid w:val="008D51C4"/>
-    <w:pPr>
-      <w:numPr>
-        <w:ilvl w:val="1"/>
-      </w:numPr>
-    </w:pPr>
     <w:rPr>
       <w:rFonts w:eastAsiaTheme="majorEastAsia" w:cstheme="majorBidi"/>
       <w:color w:val="595959" w:themeColor="text1" w:themeTint="A6"/>
@@ -1614,130 +1738,11 @@
       <w:szCs w:val="28"/>
     </w:rPr>
   </w:style>
-  <w:style w:type="character" w:customStyle="1" w:styleId="SubtitleChar">
-    <w:name w:val="Subtitle Char"/>
-    <w:basedOn w:val="DefaultParagraphFont"/>
-    <w:link w:val="Subtitle"/>
-    <w:uiPriority w:val="11"/>
-    <w:rsid w:val="008D51C4"/>
-    <w:rPr>
-      <w:rFonts w:eastAsiaTheme="majorEastAsia" w:cstheme="majorBidi"/>
-      <w:color w:val="595959" w:themeColor="text1" w:themeTint="A6"/>
-      <w:spacing w:val="15"/>
-      <w:sz w:val="28"/>
-      <w:szCs w:val="28"/>
-    </w:rPr>
-  </w:style>
-  <w:style w:type="paragraph" w:styleId="Quote">
-    <w:name w:val="Quote"/>
-    <w:basedOn w:val="Normal"/>
-    <w:next w:val="Normal"/>
-    <w:link w:val="QuoteChar"/>
-    <w:uiPriority w:val="29"/>
-    <w:qFormat/>
-    <w:rsid w:val="008D51C4"/>
-    <w:pPr>
-      <w:spacing w:before="160"/>
-      <w:jc w:val="center"/>
-    </w:pPr>
-    <w:rPr>
-      <w:i/>
-      <w:iCs/>
-      <w:color w:val="404040" w:themeColor="text1" w:themeTint="BF"/>
-    </w:rPr>
-  </w:style>
-  <w:style w:type="character" w:customStyle="1" w:styleId="QuoteChar">
-    <w:name w:val="Quote Char"/>
-    <w:basedOn w:val="DefaultParagraphFont"/>
-    <w:link w:val="Quote"/>
-    <w:uiPriority w:val="29"/>
-    <w:rsid w:val="008D51C4"/>
-    <w:rPr>
-      <w:i/>
-      <w:iCs/>
-      <w:color w:val="404040" w:themeColor="text1" w:themeTint="BF"/>
-    </w:rPr>
-  </w:style>
-  <w:style w:type="paragraph" w:styleId="ListParagraph">
-    <w:name w:val="List Paragraph"/>
-    <w:basedOn w:val="Normal"/>
-    <w:uiPriority w:val="34"/>
-    <w:qFormat/>
-    <w:rsid w:val="008D51C4"/>
-    <w:pPr>
-      <w:ind w:left="720"/>
-      <w:contextualSpacing/>
-    </w:pPr>
-  </w:style>
-  <w:style w:type="character" w:styleId="IntenseEmphasis">
-    <w:name w:val="Intense Emphasis"/>
-    <w:basedOn w:val="DefaultParagraphFont"/>
-    <w:uiPriority w:val="21"/>
-    <w:qFormat/>
-    <w:rsid w:val="008D51C4"/>
-    <w:rPr>
-      <w:i/>
-      <w:iCs/>
-      <w:color w:val="0F4761" w:themeColor="accent1" w:themeShade="BF"/>
-    </w:rPr>
-  </w:style>
-  <w:style w:type="paragraph" w:styleId="IntenseQuote">
-    <w:name w:val="Intense Quote"/>
-    <w:basedOn w:val="Normal"/>
-    <w:next w:val="Normal"/>
-    <w:link w:val="IntenseQuoteChar"/>
-    <w:uiPriority w:val="30"/>
-    <w:qFormat/>
-    <w:rsid w:val="008D51C4"/>
-    <w:pPr>
-      <w:pBdr>
-        <w:top w:val="single" w:sz="4" w:space="10" w:color="0F4761" w:themeColor="accent1" w:themeShade="BF"/>
-        <w:bottom w:val="single" w:sz="4" w:space="10" w:color="0F4761" w:themeColor="accent1" w:themeShade="BF"/>
-      </w:pBdr>
-      <w:spacing w:before="360" w:after="360"/>
-      <w:ind w:left="864" w:right="864"/>
-      <w:jc w:val="center"/>
-    </w:pPr>
-    <w:rPr>
-      <w:i/>
-      <w:iCs/>
-      <w:color w:val="0F4761" w:themeColor="accent1" w:themeShade="BF"/>
-    </w:rPr>
-  </w:style>
-  <w:style w:type="character" w:customStyle="1" w:styleId="IntenseQuoteChar">
-    <w:name w:val="Intense Quote Char"/>
-    <w:basedOn w:val="DefaultParagraphFont"/>
-    <w:link w:val="IntenseQuote"/>
-    <w:uiPriority w:val="30"/>
-    <w:rsid w:val="008D51C4"/>
-    <w:rPr>
-      <w:i/>
-      <w:iCs/>
-      <w:color w:val="0F4761" w:themeColor="accent1" w:themeShade="BF"/>
-    </w:rPr>
-  </w:style>
-  <w:style w:type="character" w:styleId="IntenseReference">
-    <w:name w:val="Intense Reference"/>
-    <w:basedOn w:val="DefaultParagraphFont"/>
-    <w:uiPriority w:val="32"/>
-    <w:qFormat/>
-    <w:rsid w:val="008D51C4"/>
-    <w:rPr>
-      <w:b/>
-      <w:bCs/>
-      <w:smallCaps/>
-      <w:color w:val="0F4761" w:themeColor="accent1" w:themeShade="BF"/>
-      <w:spacing w:val="5"/>
-    </w:rPr>
-  </w:style>
   <w:style w:type="table" w:styleId="TableGrid">
     <w:name w:val="Table Grid"/>
     <w:basedOn w:val="TableNormal"/>
     <w:uiPriority w:val="39"/>
-    <w:rsid w:val="008D51C4"/>
-    <w:pPr>
-      <w:spacing w:after="0" w:line="240" w:lineRule="auto"/>
-    </w:pPr>
+    <w:qFormat/>
     <w:rPr>
       <w:rFonts w:eastAsiaTheme="minorEastAsia"/>
     </w:rPr>
@@ -1752,39 +1757,274 @@
       </w:tblBorders>
     </w:tblPr>
   </w:style>
-  <w:style w:type="character" w:styleId="Hyperlink">
-    <w:name w:val="Hyperlink"/>
+  <w:style w:type="paragraph" w:styleId="Title">
+    <w:name w:val="Title"/>
+    <w:basedOn w:val="Normal"/>
+    <w:next w:val="Normal"/>
+    <w:link w:val="TitleChar"/>
+    <w:uiPriority w:val="10"/>
+    <w:qFormat/>
+    <w:pPr>
+      <w:spacing w:after="80" w:line="240" w:lineRule="auto"/>
+      <w:contextualSpacing/>
+    </w:pPr>
+    <w:rPr>
+      <w:rFonts w:asciiTheme="majorHAnsi" w:eastAsiaTheme="majorEastAsia" w:hAnsiTheme="majorHAnsi" w:cstheme="majorBidi"/>
+      <w:spacing w:val="-10"/>
+      <w:kern w:val="28"/>
+      <w:sz w:val="56"/>
+      <w:szCs w:val="56"/>
+    </w:rPr>
+  </w:style>
+  <w:style w:type="character" w:customStyle="1" w:styleId="Heading1Char">
+    <w:name w:val="Heading 1 Char"/>
     <w:basedOn w:val="DefaultParagraphFont"/>
-    <w:uiPriority w:val="99"/>
-    <w:unhideWhenUsed/>
-    <w:rsid w:val="008D51C4"/>
-    <w:rPr>
-      <w:color w:val="467886" w:themeColor="hyperlink"/>
-      <w:u w:val="single"/>
-    </w:rPr>
-  </w:style>
-  <w:style w:type="character" w:styleId="UnresolvedMention">
-    <w:name w:val="Unresolved Mention"/>
+    <w:link w:val="Heading1"/>
+    <w:uiPriority w:val="9"/>
+    <w:qFormat/>
+    <w:rPr>
+      <w:rFonts w:asciiTheme="majorHAnsi" w:eastAsiaTheme="majorEastAsia" w:hAnsiTheme="majorHAnsi" w:cstheme="majorBidi"/>
+      <w:color w:val="0F4761" w:themeColor="accent1" w:themeShade="BF"/>
+      <w:sz w:val="40"/>
+      <w:szCs w:val="40"/>
+    </w:rPr>
+  </w:style>
+  <w:style w:type="character" w:customStyle="1" w:styleId="Heading2Char">
+    <w:name w:val="Heading 2 Char"/>
+    <w:basedOn w:val="DefaultParagraphFont"/>
+    <w:link w:val="Heading2"/>
+    <w:uiPriority w:val="9"/>
+    <w:semiHidden/>
+    <w:qFormat/>
+    <w:rPr>
+      <w:rFonts w:asciiTheme="majorHAnsi" w:eastAsiaTheme="majorEastAsia" w:hAnsiTheme="majorHAnsi" w:cstheme="majorBidi"/>
+      <w:color w:val="0F4761" w:themeColor="accent1" w:themeShade="BF"/>
+      <w:sz w:val="32"/>
+      <w:szCs w:val="32"/>
+    </w:rPr>
+  </w:style>
+  <w:style w:type="character" w:customStyle="1" w:styleId="Heading3Char">
+    <w:name w:val="Heading 3 Char"/>
+    <w:basedOn w:val="DefaultParagraphFont"/>
+    <w:link w:val="Heading3"/>
+    <w:uiPriority w:val="9"/>
+    <w:semiHidden/>
+    <w:qFormat/>
+    <w:rPr>
+      <w:rFonts w:eastAsiaTheme="majorEastAsia" w:cstheme="majorBidi"/>
+      <w:color w:val="0F4761" w:themeColor="accent1" w:themeShade="BF"/>
+      <w:sz w:val="28"/>
+      <w:szCs w:val="28"/>
+    </w:rPr>
+  </w:style>
+  <w:style w:type="character" w:customStyle="1" w:styleId="Heading4Char">
+    <w:name w:val="Heading 4 Char"/>
+    <w:basedOn w:val="DefaultParagraphFont"/>
+    <w:link w:val="Heading4"/>
+    <w:uiPriority w:val="9"/>
+    <w:semiHidden/>
+    <w:qFormat/>
+    <w:rPr>
+      <w:rFonts w:eastAsiaTheme="majorEastAsia" w:cstheme="majorBidi"/>
+      <w:i/>
+      <w:iCs/>
+      <w:color w:val="0F4761" w:themeColor="accent1" w:themeShade="BF"/>
+    </w:rPr>
+  </w:style>
+  <w:style w:type="character" w:customStyle="1" w:styleId="Heading5Char">
+    <w:name w:val="Heading 5 Char"/>
+    <w:basedOn w:val="DefaultParagraphFont"/>
+    <w:link w:val="Heading5"/>
+    <w:uiPriority w:val="9"/>
+    <w:semiHidden/>
+    <w:rPr>
+      <w:rFonts w:eastAsiaTheme="majorEastAsia" w:cstheme="majorBidi"/>
+      <w:color w:val="0F4761" w:themeColor="accent1" w:themeShade="BF"/>
+    </w:rPr>
+  </w:style>
+  <w:style w:type="character" w:customStyle="1" w:styleId="Heading6Char">
+    <w:name w:val="Heading 6 Char"/>
+    <w:basedOn w:val="DefaultParagraphFont"/>
+    <w:link w:val="Heading6"/>
+    <w:uiPriority w:val="9"/>
+    <w:semiHidden/>
+    <w:qFormat/>
+    <w:rPr>
+      <w:rFonts w:eastAsiaTheme="majorEastAsia" w:cstheme="majorBidi"/>
+      <w:i/>
+      <w:iCs/>
+      <w:color w:val="595959" w:themeColor="text1" w:themeTint="A6"/>
+    </w:rPr>
+  </w:style>
+  <w:style w:type="character" w:customStyle="1" w:styleId="Heading7Char">
+    <w:name w:val="Heading 7 Char"/>
+    <w:basedOn w:val="DefaultParagraphFont"/>
+    <w:link w:val="Heading7"/>
+    <w:uiPriority w:val="9"/>
+    <w:semiHidden/>
+    <w:qFormat/>
+    <w:rPr>
+      <w:rFonts w:eastAsiaTheme="majorEastAsia" w:cstheme="majorBidi"/>
+      <w:color w:val="595959" w:themeColor="text1" w:themeTint="A6"/>
+    </w:rPr>
+  </w:style>
+  <w:style w:type="character" w:customStyle="1" w:styleId="Heading8Char">
+    <w:name w:val="Heading 8 Char"/>
+    <w:basedOn w:val="DefaultParagraphFont"/>
+    <w:link w:val="Heading8"/>
+    <w:uiPriority w:val="9"/>
+    <w:semiHidden/>
+    <w:rPr>
+      <w:rFonts w:eastAsiaTheme="majorEastAsia" w:cstheme="majorBidi"/>
+      <w:i/>
+      <w:iCs/>
+      <w:color w:val="262626" w:themeColor="text1" w:themeTint="D9"/>
+    </w:rPr>
+  </w:style>
+  <w:style w:type="character" w:customStyle="1" w:styleId="Heading9Char">
+    <w:name w:val="Heading 9 Char"/>
+    <w:basedOn w:val="DefaultParagraphFont"/>
+    <w:link w:val="Heading9"/>
+    <w:uiPriority w:val="9"/>
+    <w:semiHidden/>
+    <w:rPr>
+      <w:rFonts w:eastAsiaTheme="majorEastAsia" w:cstheme="majorBidi"/>
+      <w:color w:val="262626" w:themeColor="text1" w:themeTint="D9"/>
+    </w:rPr>
+  </w:style>
+  <w:style w:type="character" w:customStyle="1" w:styleId="TitleChar">
+    <w:name w:val="Title Char"/>
+    <w:basedOn w:val="DefaultParagraphFont"/>
+    <w:link w:val="Title"/>
+    <w:uiPriority w:val="10"/>
+    <w:rPr>
+      <w:rFonts w:asciiTheme="majorHAnsi" w:eastAsiaTheme="majorEastAsia" w:hAnsiTheme="majorHAnsi" w:cstheme="majorBidi"/>
+      <w:spacing w:val="-10"/>
+      <w:kern w:val="28"/>
+      <w:sz w:val="56"/>
+      <w:szCs w:val="56"/>
+    </w:rPr>
+  </w:style>
+  <w:style w:type="character" w:customStyle="1" w:styleId="SubtitleChar">
+    <w:name w:val="Subtitle Char"/>
+    <w:basedOn w:val="DefaultParagraphFont"/>
+    <w:link w:val="Subtitle"/>
+    <w:uiPriority w:val="11"/>
+    <w:qFormat/>
+    <w:rPr>
+      <w:rFonts w:eastAsiaTheme="majorEastAsia" w:cstheme="majorBidi"/>
+      <w:color w:val="595959" w:themeColor="text1" w:themeTint="A6"/>
+      <w:spacing w:val="15"/>
+      <w:sz w:val="28"/>
+      <w:szCs w:val="28"/>
+    </w:rPr>
+  </w:style>
+  <w:style w:type="paragraph" w:styleId="Quote">
+    <w:name w:val="Quote"/>
+    <w:basedOn w:val="Normal"/>
+    <w:next w:val="Normal"/>
+    <w:link w:val="QuoteChar"/>
+    <w:uiPriority w:val="29"/>
+    <w:qFormat/>
+    <w:pPr>
+      <w:spacing w:before="160"/>
+      <w:jc w:val="center"/>
+    </w:pPr>
+    <w:rPr>
+      <w:i/>
+      <w:iCs/>
+      <w:color w:val="404040" w:themeColor="text1" w:themeTint="BF"/>
+    </w:rPr>
+  </w:style>
+  <w:style w:type="character" w:customStyle="1" w:styleId="QuoteChar">
+    <w:name w:val="Quote Char"/>
+    <w:basedOn w:val="DefaultParagraphFont"/>
+    <w:link w:val="Quote"/>
+    <w:uiPriority w:val="29"/>
+    <w:qFormat/>
+    <w:rPr>
+      <w:i/>
+      <w:iCs/>
+      <w:color w:val="404040" w:themeColor="text1" w:themeTint="BF"/>
+    </w:rPr>
+  </w:style>
+  <w:style w:type="paragraph" w:styleId="ListParagraph">
+    <w:name w:val="List Paragraph"/>
+    <w:basedOn w:val="Normal"/>
+    <w:uiPriority w:val="34"/>
+    <w:qFormat/>
+    <w:pPr>
+      <w:ind w:left="720"/>
+      <w:contextualSpacing/>
+    </w:pPr>
+  </w:style>
+  <w:style w:type="character" w:customStyle="1" w:styleId="IntenseEmphasis1">
+    <w:name w:val="Intense Emphasis1"/>
+    <w:basedOn w:val="DefaultParagraphFont"/>
+    <w:uiPriority w:val="21"/>
+    <w:qFormat/>
+    <w:rPr>
+      <w:i/>
+      <w:iCs/>
+      <w:color w:val="0F4761" w:themeColor="accent1" w:themeShade="BF"/>
+    </w:rPr>
+  </w:style>
+  <w:style w:type="paragraph" w:styleId="IntenseQuote">
+    <w:name w:val="Intense Quote"/>
+    <w:basedOn w:val="Normal"/>
+    <w:next w:val="Normal"/>
+    <w:link w:val="IntenseQuoteChar"/>
+    <w:uiPriority w:val="30"/>
+    <w:qFormat/>
+    <w:pPr>
+      <w:pBdr>
+        <w:top w:val="single" w:sz="4" w:space="10" w:color="0F4761" w:themeColor="accent1" w:themeShade="BF"/>
+        <w:bottom w:val="single" w:sz="4" w:space="10" w:color="0F4761" w:themeColor="accent1" w:themeShade="BF"/>
+      </w:pBdr>
+      <w:spacing w:before="360" w:after="360"/>
+      <w:ind w:left="864" w:right="864"/>
+      <w:jc w:val="center"/>
+    </w:pPr>
+    <w:rPr>
+      <w:i/>
+      <w:iCs/>
+      <w:color w:val="0F4761" w:themeColor="accent1" w:themeShade="BF"/>
+    </w:rPr>
+  </w:style>
+  <w:style w:type="character" w:customStyle="1" w:styleId="IntenseQuoteChar">
+    <w:name w:val="Intense Quote Char"/>
+    <w:basedOn w:val="DefaultParagraphFont"/>
+    <w:link w:val="IntenseQuote"/>
+    <w:uiPriority w:val="30"/>
+    <w:rPr>
+      <w:i/>
+      <w:iCs/>
+      <w:color w:val="0F4761" w:themeColor="accent1" w:themeShade="BF"/>
+    </w:rPr>
+  </w:style>
+  <w:style w:type="character" w:customStyle="1" w:styleId="IntenseReference1">
+    <w:name w:val="Intense Reference1"/>
+    <w:basedOn w:val="DefaultParagraphFont"/>
+    <w:uiPriority w:val="32"/>
+    <w:qFormat/>
+    <w:rPr>
+      <w:b/>
+      <w:bCs/>
+      <w:smallCaps/>
+      <w:color w:val="0F4761" w:themeColor="accent1" w:themeShade="BF"/>
+      <w:spacing w:val="5"/>
+    </w:rPr>
+  </w:style>
+  <w:style w:type="character" w:customStyle="1" w:styleId="UnresolvedMention1">
+    <w:name w:val="Unresolved Mention1"/>
     <w:basedOn w:val="DefaultParagraphFont"/>
     <w:uiPriority w:val="99"/>
     <w:semiHidden/>
     <w:unhideWhenUsed/>
-    <w:rsid w:val="008D51C4"/>
+    <w:qFormat/>
     <w:rPr>
       <w:color w:val="605E5C"/>
       <w:shd w:val="clear" w:color="auto" w:fill="E1DFDD"/>
-    </w:rPr>
-  </w:style>
-  <w:style w:type="character" w:styleId="FollowedHyperlink">
-    <w:name w:val="FollowedHyperlink"/>
-    <w:basedOn w:val="DefaultParagraphFont"/>
-    <w:uiPriority w:val="99"/>
-    <w:semiHidden/>
-    <w:unhideWhenUsed/>
-    <w:rsid w:val="008D51C4"/>
-    <w:rPr>
-      <w:color w:val="96607D" w:themeColor="followedHyperlink"/>
-      <w:u w:val="single"/>
     </w:rPr>
   </w:style>
 </w:styles>
@@ -1833,7 +2073,7 @@
     </a:clrScheme>
     <a:fontScheme name="Office">
       <a:majorFont>
-        <a:latin typeface="Aptos Display" panose="02110004020202020204"/>
+        <a:latin typeface="Aptos Display"/>
         <a:ea typeface=""/>
         <a:cs typeface=""/>
         <a:font script="Jpan" typeface="游ゴシック Light"/>
@@ -1866,26 +2106,9 @@
         <a:font script="Viet" typeface="Times New Roman"/>
         <a:font script="Uigh" typeface="Microsoft Uighur"/>
         <a:font script="Geor" typeface="Sylfaen"/>
-        <a:font script="Armn" typeface="Arial"/>
-        <a:font script="Bugi" typeface="Leelawadee UI"/>
-        <a:font script="Bopo" typeface="Microsoft JhengHei"/>
-        <a:font script="Java" typeface="Javanese Text"/>
-        <a:font script="Lisu" typeface="Segoe UI"/>
-        <a:font script="Mymr" typeface="Myanmar Text"/>
-        <a:font script="Nkoo" typeface="Ebrima"/>
-        <a:font script="Olck" typeface="Nirmala UI"/>
-        <a:font script="Osma" typeface="Ebrima"/>
-        <a:font script="Phag" typeface="Phagspa"/>
-        <a:font script="Syrn" typeface="Estrangelo Edessa"/>
-        <a:font script="Syrj" typeface="Estrangelo Edessa"/>
-        <a:font script="Syre" typeface="Estrangelo Edessa"/>
-        <a:font script="Sora" typeface="Nirmala UI"/>
-        <a:font script="Tale" typeface="Microsoft Tai Le"/>
-        <a:font script="Talu" typeface="Microsoft New Tai Lue"/>
-        <a:font script="Tfng" typeface="Ebrima"/>
       </a:majorFont>
       <a:minorFont>
-        <a:latin typeface="Aptos" panose="02110004020202020204"/>
+        <a:latin typeface="Aptos"/>
         <a:ea typeface=""/>
         <a:cs typeface=""/>
         <a:font script="Jpan" typeface="游ゴシック"/>
@@ -1918,23 +2141,6 @@
         <a:font script="Viet" typeface="Arial"/>
         <a:font script="Uigh" typeface="Microsoft Uighur"/>
         <a:font script="Geor" typeface="Sylfaen"/>
-        <a:font script="Armn" typeface="Arial"/>
-        <a:font script="Bugi" typeface="Leelawadee UI"/>
-        <a:font script="Bopo" typeface="Microsoft JhengHei"/>
-        <a:font script="Java" typeface="Javanese Text"/>
-        <a:font script="Lisu" typeface="Segoe UI"/>
-        <a:font script="Mymr" typeface="Myanmar Text"/>
-        <a:font script="Nkoo" typeface="Ebrima"/>
-        <a:font script="Olck" typeface="Nirmala UI"/>
-        <a:font script="Osma" typeface="Ebrima"/>
-        <a:font script="Phag" typeface="Phagspa"/>
-        <a:font script="Syrn" typeface="Estrangelo Edessa"/>
-        <a:font script="Syrj" typeface="Estrangelo Edessa"/>
-        <a:font script="Syre" typeface="Estrangelo Edessa"/>
-        <a:font script="Sora" typeface="Nirmala UI"/>
-        <a:font script="Tale" typeface="Microsoft Tai Le"/>
-        <a:font script="Talu" typeface="Microsoft New Tai Lue"/>
-        <a:font script="Tfng" typeface="Ebrima"/>
       </a:minorFont>
     </a:fontScheme>
     <a:fmtScheme name="Office">
@@ -2077,11 +2283,6 @@
   </a:themeElements>
   <a:objectDefaults/>
   <a:extraClrSchemeLst/>
-  <a:extLst>
-    <a:ext uri="{05A4C25C-085E-4340-85A3-A5531E510DB2}">
-      <thm15:themeFamily xmlns:thm15="http://schemas.microsoft.com/office/thememl/2012/main" name="Office Theme" id="{62F939B6-93AF-4DB8-9C6B-D6C7DFDC589F}" vid="{4A3C46E8-61CC-4603-A589-7422A47A8E4A}"/>
-    </a:ext>
-  </a:extLst>
 </a:theme>
 </file>
 
@@ -2282,6 +2483,10 @@
 </p:properties>
 </file>
 
+<file path=customXml/item4.xml><?xml version="1.0" encoding="utf-8"?>
+<b:Sources xmlns:b="http://schemas.openxmlformats.org/officeDocument/2006/bibliography" xmlns="http://schemas.openxmlformats.org/officeDocument/2006/bibliography" SelectedStyle="\APASixthEditionOfficeOnline.xsl" StyleName="APA" Version="6"/>
+</file>
+
 <file path=customXml/itemProps1.xml><?xml version="1.0" encoding="utf-8"?>
 <ds:datastoreItem xmlns:ds="http://schemas.openxmlformats.org/officeDocument/2006/customXml" ds:itemID="{000AB969-EF2F-4C3C-B7C8-93820209FDB1}">
   <ds:schemaRefs>
@@ -2316,4 +2521,12 @@
     <ds:schemaRef ds:uri="6f998414-196f-469d-b2e2-7836a2b5e375"/>
   </ds:schemaRefs>
 </ds:datastoreItem>
+</file>
+
+<file path=customXml/itemProps4.xml><?xml version="1.0" encoding="utf-8"?>
+<ds:datastoreItem xmlns:ds="http://schemas.openxmlformats.org/officeDocument/2006/customXml" ds:itemID="{5390ACF0-52E4-4800-AD2B-F5035CE2D781}">
+  <ds:schemaRefs>
+    <ds:schemaRef ds:uri="http://schemas.openxmlformats.org/officeDocument/2006/bibliography"/>
+  </ds:schemaRefs>
+</ds:datastoreItem>
 </file>
</xml_diff>